<commit_message>
created new resume - added to project folder
</commit_message>
<xml_diff>
--- a/Resume.2.noaddress.docx
+++ b/Resume.2.noaddress.docx
@@ -22,7 +22,8 @@
     <w:p>
       <w:pPr>
         <w:spacing w:after="0" w:line="259" w:lineRule="auto"/>
-        <w:ind w:left="2572" w:right="0" w:firstLine="0"/>
+        <w:ind w:right="0"/>
+        <w:jc w:val="center"/>
       </w:pPr>
       <w:r>
         <w:t xml:space="preserve">+1 (321)-205-6097 | </w:t>
@@ -78,7 +79,21 @@
             <w:color w:val="0462C1"/>
             <w:u w:val="single" w:color="0462C1"/>
           </w:rPr>
-          <w:t>GitHu</w:t>
+          <w:t>Git</w:t>
+        </w:r>
+        <w:r>
+          <w:rPr>
+            <w:color w:val="0462C1"/>
+            <w:u w:val="single" w:color="0462C1"/>
+          </w:rPr>
+          <w:t>H</w:t>
+        </w:r>
+        <w:r>
+          <w:rPr>
+            <w:color w:val="0462C1"/>
+            <w:u w:val="single" w:color="0462C1"/>
+          </w:rPr>
+          <w:t>u</w:t>
         </w:r>
       </w:hyperlink>
       <w:hyperlink r:id="rId12">
@@ -90,9 +105,27 @@
           <w:t>b</w:t>
         </w:r>
       </w:hyperlink>
-      <w:hyperlink r:id="rId13">
+      <w:r>
+        <w:t xml:space="preserve"> | </w:t>
+      </w:r>
+      <w:hyperlink r:id="rId13" w:history="1">
         <w:r>
-          <w:t xml:space="preserve">  </w:t>
+          <w:rPr>
+            <w:rStyle w:val="Hyperlink"/>
+          </w:rPr>
+          <w:t>Portfo</w:t>
+        </w:r>
+        <w:r>
+          <w:rPr>
+            <w:rStyle w:val="Hyperlink"/>
+          </w:rPr>
+          <w:t>l</w:t>
+        </w:r>
+        <w:r>
+          <w:rPr>
+            <w:rStyle w:val="Hyperlink"/>
+          </w:rPr>
+          <w:t>io</w:t>
         </w:r>
       </w:hyperlink>
     </w:p>
@@ -445,7 +478,7 @@
           </mc:Choice>
           <mc:Fallback>
             <w:pict>
-              <v:group w14:anchorId="33561349" id="Group 2076" o:spid="_x0000_s1026" style="width:543.45pt;height:.5pt;mso-position-horizontal-relative:char;mso-position-vertical-relative:line" coordsize="69021,63" o:gfxdata="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">
+              <v:group w14:anchorId="6468AF94" id="Group 2076" o:spid="_x0000_s1026" style="width:543.45pt;height:.5pt;mso-position-horizontal-relative:char;mso-position-vertical-relative:line" coordsize="69021,63" o:gfxdata="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">
                 <v:shape id="Shape 2430" o:spid="_x0000_s1027" style="position:absolute;width:37037;height:91;visibility:visible;mso-wrap-style:square;v-text-anchor:top" coordsize="3703701,9144" o:gfxdata="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" path="m,l3703701,r,9144l,9144,,e" fillcolor="black" stroked="f" strokeweight="0">
                   <v:stroke miterlimit="83231f" joinstyle="miter"/>
                   <v:path arrowok="t" textboxrect="0,0,3703701,9144"/>
@@ -2675,6 +2708,41 @@
       <w:contextualSpacing/>
     </w:pPr>
   </w:style>
+  <w:style w:type="character" w:styleId="Hyperlink">
+    <w:name w:val="Hyperlink"/>
+    <w:basedOn w:val="DefaultParagraphFont"/>
+    <w:uiPriority w:val="99"/>
+    <w:unhideWhenUsed/>
+    <w:rsid w:val="00844F44"/>
+    <w:rPr>
+      <w:color w:val="0563C1" w:themeColor="hyperlink"/>
+      <w:u w:val="single"/>
+    </w:rPr>
+  </w:style>
+  <w:style w:type="character" w:styleId="UnresolvedMention">
+    <w:name w:val="Unresolved Mention"/>
+    <w:basedOn w:val="DefaultParagraphFont"/>
+    <w:uiPriority w:val="99"/>
+    <w:semiHidden/>
+    <w:unhideWhenUsed/>
+    <w:rsid w:val="00844F44"/>
+    <w:rPr>
+      <w:color w:val="605E5C"/>
+      <w:shd w:val="clear" w:color="auto" w:fill="E1DFDD"/>
+    </w:rPr>
+  </w:style>
+  <w:style w:type="character" w:styleId="FollowedHyperlink">
+    <w:name w:val="FollowedHyperlink"/>
+    <w:basedOn w:val="DefaultParagraphFont"/>
+    <w:uiPriority w:val="99"/>
+    <w:semiHidden/>
+    <w:unhideWhenUsed/>
+    <w:rsid w:val="00844F44"/>
+    <w:rPr>
+      <w:color w:val="954F72" w:themeColor="followedHyperlink"/>
+      <w:u w:val="single"/>
+    </w:rPr>
+  </w:style>
 </w:styles>
 </file>
 

</xml_diff>